<commit_message>
fix recommendations + copilot logging + UX polish + docs regen
- recommendations: rollback in refresh_user_embedding on SQLite locked
  to avoid PendingRollbackError killing GET /recommendations with 500
- copilot: logger.exception in all fallback branches so the real cause
  surfaces instead of generic "временно недоступен"
- scheduler: digest_interval_minutes + digest_run_on_startup settings
  for dev-mode 10-minute digest
- bot: ReplyKeyboardRemove on /start to clear stale setup keyboard
- bot: skipping the tour now shows a follow-up "Начать настройку" CTA
- ai: clean Russian labels in «Почему» (no more LinUCB/LightGCN/etc.)
- docs: scripts/regenerate_docs.py regenerates Обзор / План / Отчёт
  to match current implementation; CLAUDE.md adds session bootstrap

Co-Authored-By: Claude Opus 4.7 <noreply@anthropic.com>
</commit_message>
<xml_diff>
--- a/docs/Обзор_проекта_EventMind.docx
+++ b/docs/Обзор_проекта_EventMind.docx
@@ -5,26 +5,21 @@
     <w:p>
       <w:pPr>
         <w:pStyle w:val="H1"/>
-        <w:jc w:val="center"/>
       </w:pPr>
       <w:r>
         <w:t>Обзор проекта EventMind</w:t>
       </w:r>
     </w:p>
     <w:p>
-      <w:pPr>
-        <w:jc w:val="both"/>
-      </w:pPr>
+      <w:pPr/>
       <w:r>
-        <w:t>Документ описывает состояние проекта EventMind по итогам аудита и пакета доработок, выполненных в мае 2026 года. Цель документа — зафиксировать, что реализовано, какие дефекты устранены, что было изменено и какие направления развития остаются открытыми.</w:t>
+        <w:t>Документ описывает актуальное состояние проекта EventMind по итогам майской итерации 2026. Здесь зафиксированы: какие подсистемы работают, какие компоненты алгоритма ранжирования включены, какие правки были сделаны за последнюю неделю и что остаётся открытым.</w:t>
       </w:r>
     </w:p>
     <w:p>
-      <w:pPr>
-        <w:jc w:val="both"/>
-      </w:pPr>
+      <w:pPr/>
       <w:r>
-        <w:t>Дата сборки документа: 26 мая 2026 г.</w:t>
+        <w:t>Дата сборки документа: 29 мая 2026 г.</w:t>
       </w:r>
     </w:p>
     <w:p>
@@ -36,35 +31,27 @@
       </w:r>
     </w:p>
     <w:p>
-      <w:pPr>
-        <w:jc w:val="both"/>
-      </w:pPr>
+      <w:pPr/>
       <w:r>
-        <w:t>EventMind — система агрегации IT-мероприятий и персонализированных рекомендаций, состоящая из трёх независимых процессов: REST API на FastAPI, Telegram-бота на aiogram 3 и планировщика рассылок/ингеста на APScheduler. Источник истины — реляционная БД через SQLAlchemy 2 (SQLite для разработки, PostgreSQL с расширением pgvector — для прод-эксплуатации). Миграции выполняются через Alembic, на текущий момент 9 ревизий.</w:t>
+        <w:t>EventMind — система агрегации IT-мероприятий и персонализированных рекомендаций. Архитектура построена из трёх независимых процессов: REST API на FastAPI, Telegram-бот на aiogram 3 и фоновый scheduler на APScheduler. Каждый процесс работает в своём контейнере и общается с другими через REST и общую базу данных.</w:t>
       </w:r>
     </w:p>
     <w:p>
-      <w:pPr>
-        <w:jc w:val="both"/>
-      </w:pPr>
+      <w:pPr/>
       <w:r>
-        <w:t>Рекомендательная подсистема — гибридная: rule-based сигнал по темам и формату совмещается с косинусной близостью эмбеддингов (sentence-transformers paraphrase-multilingual-MiniLM-L12-v2), Bayesian Thompson sampling над тематическими предпочтениями, контекстным бандитом LinUCB, коллаборативной компонентой LightGCN, скоринг качества и хайпа, freshness-decay и skill-gap-сигналом. Поверх — MMR-диверсификация. Дополнительно реализованы дедупликация по семантике, RAG-retrieval и long-term memory пользователя (mem0-style).</w:t>
+        <w:t>Рекомендательная подсистема — гибридная. На каждый запрос параллельно считаются девять компонентов: правила по совпадению профиля, семантическая близость по эмбеддингам, байесовская модель предпочтений тем (Thompson sampling), скоры качества и актуальности, свежесть даты, соответствие карьерным целям, контекстный бандит LinUCB и коллаборативный сигнал LightGCN. Итог взвешивается, сортируется и пропускается через MMR-диверсификацию.</w:t>
       </w:r>
     </w:p>
     <w:p>
-      <w:pPr>
-        <w:jc w:val="both"/>
-      </w:pPr>
+      <w:pPr/>
       <w:r>
-        <w:t>AI-слой — LangGraph + langchain-groq. AI-рекомендации в эндпоинте /agent-recommendations теперь работают по схеме «hybrid-отбор + один LLM-вызов» (вариант C) и отвечают ~3 с вместо прежних ~15. Copilot сохранён как Supervisor-Worker граф с пятью специалистами и пятью function-calling-инструментами.</w:t>
+        <w:t>AI-слой реализован на LangGraph и langchain-groq. Endpoint /agent-recommendations берёт top-N от hybrid и одним вызовом LLM получает объяснения. Endpoint /copilot/{tid}/turn — мульти-туровый диалог: Supervisor-Worker граф с пятью специалистами и поддерживаемой через таблицу copilot_sessions памятью.</w:t>
       </w:r>
     </w:p>
     <w:p>
-      <w:pPr>
-        <w:jc w:val="both"/>
-      </w:pPr>
+      <w:pPr/>
       <w:r>
-        <w:t>Подсистема ингеста — унифицированный интерфейс источника, реализованы адаптеры Habr, RSS/Atom, KudaGo, Lu.ma (ICS), Meetup (скелет), Telegram-каналов через web-preview. Сырые записи проходят через AI-нормализатор, который извлекает format/city/level/tech_stack и оценки качества/хайпа.</w:t>
+        <w:t>Подсистема ingestion включает шесть адаптеров: Habr, RSS/Atom, KudaGo, Lu.ma (ICS), Meetup (GraphQL), Telegram-каналы (web-preview). Каждое сырое сообщение проходит через LLM-нормализацию с Pydantic-валидацией, дедупликацию по cosine ≥ 0.92 и записывается в events. Запуск — периодически через scheduler, разделение по интервалам через INGEST_INTERVAL_HOURS.</w:t>
       </w:r>
     </w:p>
     <w:p>
@@ -72,14 +59,12 @@
         <w:pStyle w:val="H3"/>
       </w:pPr>
       <w:r>
-        <w:t>1.1. Ключевые технологии</w:t>
+        <w:t>1.1. Ключевой стек</w:t>
       </w:r>
     </w:p>
     <w:p>
       <w:pPr>
         <w:pStyle w:val="ListBullet"/>
-        <w:ind w:firstLine="0"/>
-        <w:jc w:val="both"/>
       </w:pPr>
       <w:r>
         <w:t>Python 3.12, FastAPI 0.110, Uvicorn, aiogram 3.13</w:t>
@@ -88,8 +73,6 @@
     <w:p>
       <w:pPr>
         <w:pStyle w:val="ListBullet"/>
-        <w:ind w:firstLine="0"/>
-        <w:jc w:val="both"/>
       </w:pPr>
       <w:r>
         <w:t>SQLAlchemy 2.0 + Alembic; SQLite (dev) и PostgreSQL + pgvector (prod)</w:t>
@@ -98,8 +81,6 @@
     <w:p>
       <w:pPr>
         <w:pStyle w:val="ListBullet"/>
-        <w:ind w:firstLine="0"/>
-        <w:jc w:val="both"/>
       </w:pPr>
       <w:r>
         <w:t>LangGraph 0.2, langchain-core, langchain-groq (primary llama-3.3-70b-versatile, fallback llama-3.1-8b-instant)</w:t>
@@ -108,8 +89,6 @@
     <w:p>
       <w:pPr>
         <w:pStyle w:val="ListBullet"/>
-        <w:ind w:firstLine="0"/>
-        <w:jc w:val="both"/>
       </w:pPr>
       <w:r>
         <w:t>sentence-transformers 2.7 — мультиязычный MiniLM (384 dim)</w:t>
@@ -118,18 +97,14 @@
     <w:p>
       <w:pPr>
         <w:pStyle w:val="ListBullet"/>
-        <w:ind w:firstLine="0"/>
-        <w:jc w:val="both"/>
       </w:pPr>
       <w:r>
-        <w:t>APScheduler 3.10 для дайджестов и периодического ингеста</w:t>
+        <w:t>APScheduler 3.10 для дайджестов и периодического ingestion</w:t>
       </w:r>
     </w:p>
     <w:p>
       <w:pPr>
         <w:pStyle w:val="ListBullet"/>
-        <w:ind w:firstLine="0"/>
-        <w:jc w:val="both"/>
       </w:pPr>
       <w:r>
         <w:t>feedparser, BeautifulSoup 4 + lxml, httpx, pydantic 2</w:t>
@@ -138,11 +113,17 @@
     <w:p>
       <w:pPr>
         <w:pStyle w:val="ListBullet"/>
-        <w:ind w:firstLine="0"/>
-        <w:jc w:val="both"/>
       </w:pPr>
       <w:r>
-        <w:t>pytest 8.2 — 170 тестов, ruff — 0 ошибок на app/</w:t>
+        <w:t>pytest 8.2 — 170 тестов проходят, ruff — без ошибок</w:t>
+      </w:r>
+    </w:p>
+    <w:p>
+      <w:pPr>
+        <w:pStyle w:val="ListBullet"/>
+      </w:pPr>
+      <w:r>
+        <w:t>Docker + docker-compose: три контейнера, healthcheck на бэке перед стартом bot/scheduler</w:t>
       </w:r>
     </w:p>
     <w:p>
@@ -161,215 +142,86 @@
         <w:t>2.1. Состав репозитория</w:t>
       </w:r>
     </w:p>
-    <w:tbl>
-      <w:tblPr>
-        <w:tblStyle w:val="LightGrid"/>
-        <w:tblW w:type="auto" w:w="0"/>
-        <w:tblLook w:firstColumn="1" w:firstRow="1" w:lastColumn="0" w:lastRow="0" w:noHBand="0" w:noVBand="1" w:val="04A0"/>
-      </w:tblPr>
-      <w:tblGrid>
-        <w:gridCol w:w="4320"/>
-        <w:gridCol w:w="4320"/>
-      </w:tblGrid>
-      <w:tr>
-        <w:tc>
-          <w:tcPr>
-            <w:tcW w:type="dxa" w:w="4320"/>
-          </w:tcPr>
-          <w:p>
-            <w:r>
-              <w:rPr>
-                <w:b/>
-                <w:sz w:val="22"/>
-              </w:rPr>
-              <w:t>Компонент</w:t>
-            </w:r>
-          </w:p>
-        </w:tc>
-        <w:tc>
-          <w:tcPr>
-            <w:tcW w:type="dxa" w:w="4320"/>
-          </w:tcPr>
-          <w:p>
-            <w:r>
-              <w:rPr>
-                <w:b/>
-                <w:sz w:val="22"/>
-              </w:rPr>
-              <w:t>Объём</w:t>
-            </w:r>
-          </w:p>
-        </w:tc>
-      </w:tr>
-      <w:tr>
-        <w:tc>
-          <w:tcPr>
-            <w:tcW w:type="dxa" w:w="4320"/>
-          </w:tcPr>
-          <w:p>
-            <w:r>
-              <w:rPr>
-                <w:sz w:val="22"/>
-              </w:rPr>
-              <w:t>Исходный код приложения (app/)</w:t>
-            </w:r>
-          </w:p>
-        </w:tc>
-        <w:tc>
-          <w:tcPr>
-            <w:tcW w:type="dxa" w:w="4320"/>
-          </w:tcPr>
-          <w:p>
-            <w:r>
-              <w:rPr>
-                <w:sz w:val="22"/>
-              </w:rPr>
-              <w:t>100+ модулей Python, ≈ 9 000 строк</w:t>
-            </w:r>
-          </w:p>
-        </w:tc>
-      </w:tr>
-      <w:tr>
-        <w:tc>
-          <w:tcPr>
-            <w:tcW w:type="dxa" w:w="4320"/>
-          </w:tcPr>
-          <w:p>
-            <w:r>
-              <w:rPr>
-                <w:sz w:val="22"/>
-              </w:rPr>
-              <w:t>Маршруты FastAPI</w:t>
-            </w:r>
-          </w:p>
-        </w:tc>
-        <w:tc>
-          <w:tcPr>
-            <w:tcW w:type="dxa" w:w="4320"/>
-          </w:tcPr>
-          <w:p>
-            <w:r>
-              <w:rPr>
-                <w:sz w:val="22"/>
-              </w:rPr>
-              <w:t>50 маршрутов (включая system/docs)</w:t>
-            </w:r>
-          </w:p>
-        </w:tc>
-      </w:tr>
-      <w:tr>
-        <w:tc>
-          <w:tcPr>
-            <w:tcW w:type="dxa" w:w="4320"/>
-          </w:tcPr>
-          <w:p>
-            <w:r>
-              <w:rPr>
-                <w:sz w:val="22"/>
-              </w:rPr>
-              <w:t>SQLAlchemy-модели</w:t>
-            </w:r>
-          </w:p>
-        </w:tc>
-        <w:tc>
-          <w:tcPr>
-            <w:tcW w:type="dxa" w:w="4320"/>
-          </w:tcPr>
-          <w:p>
-            <w:r>
-              <w:rPr>
-                <w:sz w:val="22"/>
-              </w:rPr>
-              <w:t>12: User, Event, RawEvent, Interaction, Topic, UserTopic, EventTopic, UserTopicStat, UserSkillProfile, UserBanditState, UserMemory, CopilotSession</w:t>
-            </w:r>
-          </w:p>
-        </w:tc>
-      </w:tr>
-      <w:tr>
-        <w:tc>
-          <w:tcPr>
-            <w:tcW w:type="dxa" w:w="4320"/>
-          </w:tcPr>
-          <w:p>
-            <w:r>
-              <w:rPr>
-                <w:sz w:val="22"/>
-              </w:rPr>
-              <w:t>Alembic-миграции</w:t>
-            </w:r>
-          </w:p>
-        </w:tc>
-        <w:tc>
-          <w:tcPr>
-            <w:tcW w:type="dxa" w:w="4320"/>
-          </w:tcPr>
-          <w:p>
-            <w:r>
-              <w:rPr>
-                <w:sz w:val="22"/>
-              </w:rPr>
-              <w:t>9 ревизий: initial → user_memories → pgvector</w:t>
-            </w:r>
-          </w:p>
-        </w:tc>
-      </w:tr>
-      <w:tr>
-        <w:tc>
-          <w:tcPr>
-            <w:tcW w:type="dxa" w:w="4320"/>
-          </w:tcPr>
-          <w:p>
-            <w:r>
-              <w:rPr>
-                <w:sz w:val="22"/>
-              </w:rPr>
-              <w:t>Тестовый набор pytest</w:t>
-            </w:r>
-          </w:p>
-        </w:tc>
-        <w:tc>
-          <w:tcPr>
-            <w:tcW w:type="dxa" w:w="4320"/>
-          </w:tcPr>
-          <w:p>
-            <w:r>
-              <w:rPr>
-                <w:sz w:val="22"/>
-              </w:rPr>
-              <w:t>170 тестов в 24 файлах, все проходят (~70 с)</w:t>
-            </w:r>
-          </w:p>
-        </w:tc>
-      </w:tr>
-      <w:tr>
-        <w:tc>
-          <w:tcPr>
-            <w:tcW w:type="dxa" w:w="4320"/>
-          </w:tcPr>
-          <w:p>
-            <w:r>
-              <w:rPr>
-                <w:sz w:val="22"/>
-              </w:rPr>
-              <w:t>Курсовые отчёты</w:t>
-            </w:r>
-          </w:p>
-        </w:tc>
-        <w:tc>
-          <w:tcPr>
-            <w:tcW w:type="dxa" w:w="4320"/>
-          </w:tcPr>
-          <w:p>
-            <w:r>
-              <w:rPr>
-                <w:sz w:val="22"/>
-              </w:rPr>
-              <w:t>2 docx (полная и сокращённая, обе обновлены Главой 5)</w:t>
-            </w:r>
-          </w:p>
-        </w:tc>
-      </w:tr>
-    </w:tbl>
+    <w:p>
+      <w:pPr>
+        <w:pStyle w:val="ListBullet"/>
+      </w:pPr>
+      <w:r>
+        <w:t>app/api — REST: routers users, events, recommendations, agent_recommendations, copilot, ingestion, analytics, subscriptions, vocabulary, admin</w:t>
+      </w:r>
+    </w:p>
+    <w:p>
+      <w:pPr>
+        <w:pStyle w:val="ListBullet"/>
+      </w:pPr>
+      <w:r>
+        <w:t>app/bot — handlers start, recommendations, profile, search, copilot, subscriptions + reply/inline-клавиатуры</w:t>
+      </w:r>
+    </w:p>
+    <w:p>
+      <w:pPr>
+        <w:pStyle w:val="ListBullet"/>
+      </w:pPr>
+      <w:r>
+        <w:t>app/recommender — hybrid, scoring, embeddings, bayesian, bandit, gnn, skill_gap, retrieval, diversity, dedup, memory, explain</w:t>
+      </w:r>
+    </w:p>
+    <w:p>
+      <w:pPr>
+        <w:pStyle w:val="ListBullet"/>
+      </w:pPr>
+      <w:r>
+        <w:t>app/agents — recommendation (event-нормализация), copilot (supervisor + 5 специалистов + tools)</w:t>
+      </w:r>
+    </w:p>
+    <w:p>
+      <w:pPr>
+        <w:pStyle w:val="ListBullet"/>
+      </w:pPr>
+      <w:r>
+        <w:t>app/ingestion — sources/{habr,rss,kudago,luma,meetup,tg_channels}</w:t>
+      </w:r>
+    </w:p>
+    <w:p>
+      <w:pPr>
+        <w:pStyle w:val="ListBullet"/>
+      </w:pPr>
+      <w:r>
+        <w:t>app/scheduler — digest + ingestion + memory compaction на APScheduler</w:t>
+      </w:r>
+    </w:p>
+    <w:p>
+      <w:pPr>
+        <w:pStyle w:val="ListBullet"/>
+      </w:pPr>
+      <w:r>
+        <w:t>app/db/models — user, event, raw_event, interaction, topic, copilot_session, user_topic_stat, user_bandit_state, user_skill_profile, user_memory</w:t>
+      </w:r>
+    </w:p>
+    <w:p>
+      <w:pPr>
+        <w:pStyle w:val="ListBullet"/>
+      </w:pPr>
+      <w:r>
+        <w:t>alembic — 10 миграций; включая pgvector, copilot_sessions, bandit_state, user_memories, skill_profile, enriched_fields</w:t>
+      </w:r>
+    </w:p>
+    <w:p>
+      <w:pPr>
+        <w:pStyle w:val="ListBullet"/>
+      </w:pPr>
+      <w:r>
+        <w:t>tests — 26 файлов, 170 кейсов: scoring, hybrid, bayesian, bandit, gnn, memory, dedup, ingestion, supervisor, copilot tools, cold-start, scheduler</w:t>
+      </w:r>
+    </w:p>
+    <w:p>
+      <w:pPr>
+        <w:pStyle w:val="ListBullet"/>
+      </w:pPr>
+      <w:r>
+        <w:t>scripts — train_gnn, eval_offline (Recall@k/nDCG@k), llm_judge, compact_memories, backfill_pgvector, make_presentation_plan, append_overview_chapter</w:t>
+      </w:r>
+    </w:p>
     <w:p>
       <w:pPr>
         <w:pStyle w:val="H3"/>
@@ -381,111 +233,89 @@
     <w:p>
       <w:pPr>
         <w:pStyle w:val="ListBullet"/>
-        <w:ind w:firstLine="0"/>
-        <w:jc w:val="both"/>
       </w:pPr>
       <w:r>
-        <w:t>REST API: пользователи, события, рекомендации, AI-рекомендации (вариант C), Copilot, ингест, подписки, аналитика, словари, admin-дашборд, deep-link.</w:t>
+        <w:t>REST API: пользователи, события, рекомендации, AI-рекомендации, Copilot (one-shot и multi-turn), ingestion (Habr, RSS, KudaGo, Lu.ma, Meetup, TG), subscriptions, аналитика трендов, словари тем/городов/форматов, admin-эндпоинты.</w:t>
       </w:r>
     </w:p>
     <w:p>
       <w:pPr>
         <w:pStyle w:val="ListBullet"/>
-        <w:ind w:firstLine="0"/>
-        <w:jc w:val="both"/>
       </w:pPr>
       <w:r>
-        <w:t>Telegram-бот: мастер настройки профиля + 4-экранный onboarding-тур, /recommend, /search, /semantic, /bio, /trending с ASCII-bar, /copilot, /undo, /subscribe; кнопки like/dislike/save с компактной строкой «Почему».</w:t>
+        <w:t>Telegram-бот: тур по командам (4 экрана) с возможностью пропустить и сразу попасть на запуск настройки; мастер настройки профиля (темы → формат → город); reply-меню «🎯 Рекомендации / 🔍 Поиск / 👤 Профиль / ⚙️ Ещё»; карточка события с кнопками ❓ Почему / 📖 Подробнее / 👍 / 👎 / ⭐ / Похожие / Следующее.</w:t>
       </w:r>
     </w:p>
     <w:p>
       <w:pPr>
         <w:pStyle w:val="ListBullet"/>
-        <w:ind w:firstLine="0"/>
-        <w:jc w:val="both"/>
       </w:pPr>
       <w:r>
-        <w:t>Hybrid recommender: rule + cosine + Bayesian Thompson + quality + hype + freshness + skill-gap + LinUCB + (опц.) LightGCN. Декомпозированный score_breakdown в ответе API.</w:t>
+        <w:t>Hybrid recommender: 9 компонентов (rule, cosine, bayesian, quality, hype, freshness, skill_gap, bandit, gnn), каждая компонента изолирована try/except — сбой одной не ломает выдачу.</w:t>
       </w:r>
     </w:p>
     <w:p>
       <w:pPr>
         <w:pStyle w:val="ListBullet"/>
-        <w:ind w:firstLine="0"/>
-        <w:jc w:val="both"/>
       </w:pPr>
       <w:r>
-        <w:t>MMR-диверсификация — после доработки фактически активна на каждом запросе /recommendations.</w:t>
+        <w:t>MMR-диверсификация: λ=0.7 по умолчанию, переключается через MMR_ENABLED, применяется поверх отсортированного списка.</w:t>
       </w:r>
     </w:p>
     <w:p>
       <w:pPr>
         <w:pStyle w:val="ListBullet"/>
-        <w:ind w:firstLine="0"/>
-        <w:jc w:val="both"/>
       </w:pPr>
       <w:r>
-        <w:t>AI-рекомендации (вариант C): hybrid отбирает top-N, один LLM-вызов с pydantic-схемой пишет короткие объяснения батчем (~3 с, limit 1..10).</w:t>
+        <w:t>AI-рекомендации (вариант C): hybrid отбирает top-N, один LLM-вызов с pydantic-схемой пишет объяснения батчем — быстрее старой 4-нодовой цепочки и без жёсткого лимита в ровно 3 карточки.</w:t>
       </w:r>
     </w:p>
     <w:p>
       <w:pPr>
         <w:pStyle w:val="ListBullet"/>
-        <w:ind w:firstLine="0"/>
-        <w:jc w:val="both"/>
       </w:pPr>
       <w:r>
-        <w:t>AI Copilot: Supervisor-Worker граф LangGraph с 5 специалистами, критик-ревизор для recommendation_specialist, function-calling-tools, многотуровый диалог через copilot_sessions.</w:t>
+        <w:t>AI Copilot: Supervisor-Worker граф LangGraph с пятью специалистами (recommendation, career_coach, roadmap, explainer, summary); пять function-calling tools (search_events, get_user_profile, get_recent_interactions, recall_about_user, get_event_details); история диалога — в copilot_sessions, multi-turn память; long-term memory подмешивается в recall.</w:t>
       </w:r>
     </w:p>
     <w:p>
       <w:pPr>
         <w:pStyle w:val="ListBullet"/>
-        <w:ind w:firstLine="0"/>
-        <w:jc w:val="both"/>
       </w:pPr>
       <w:r>
-        <w:t>Долговременная память пользователя: write/recall/extract/compact с фильтром salience и LLM-уплотнением (mem0-style).</w:t>
+        <w:t>Долговременная память пользователя (стиль mem0): write/recall/extract/compact с фильтром salience и LLM-агрегацией заметок по категориям; compaction job раз в 7 дней.</w:t>
       </w:r>
     </w:p>
     <w:p>
       <w:pPr>
         <w:pStyle w:val="ListBullet"/>
-        <w:ind w:firstLine="0"/>
-        <w:jc w:val="both"/>
       </w:pPr>
       <w:r>
-        <w:t>Ингест: 6 адаптеров источников + AI-нормализация raw_events; периодический запуск через APScheduler.</w:t>
+        <w:t>Ingestion: 6 адаптеров источников + AI-нормализация raw_events → events с Pydantic-валидацией; периодический запуск через APScheduler по INGEST_INTERVAL_HOURS; non-IT события отсеиваются.</w:t>
       </w:r>
     </w:p>
     <w:p>
       <w:pPr>
         <w:pStyle w:val="ListBullet"/>
-        <w:ind w:firstLine="0"/>
-        <w:jc w:val="both"/>
       </w:pPr>
       <w:r>
-        <w:t>Семантическая дедупликация (порог 0.92), MMR (λ=0.7, top-30).</w:t>
+        <w:t>Семантическая дедупликация — cosine ≥ 0.92 за 90 дней.</w:t>
       </w:r>
     </w:p>
     <w:p>
       <w:pPr>
         <w:pStyle w:val="ListBullet"/>
-        <w:ind w:firstLine="0"/>
-        <w:jc w:val="both"/>
       </w:pPr>
       <w:r>
-        <w:t>Эвал: scripts/eval_offline.py (leave-one-out, Recall@k/nDCG@k) и scripts/llm_judge.py.</w:t>
+        <w:t>Эвал: scripts/eval_offline.py (leave-one-out, Recall@k/nDCG@k для rule/hybrid/bandit) и scripts/llm_judge.py (LLM-судья поверх ленты).</w:t>
       </w:r>
     </w:p>
     <w:p>
       <w:pPr>
         <w:pStyle w:val="ListBullet"/>
-        <w:ind w:firstLine="0"/>
-        <w:jc w:val="both"/>
       </w:pPr>
       <w:r>
-        <w:t>Деплой: Dockerfile + docker-compose с тремя сервисами; healthcheck перед стартом bot/scheduler.</w:t>
+        <w:t>Деплой: Dockerfile + docker-compose; три сервиса (api, bot, scheduler); healthcheck на бэке перед стартом зависимых; INGEST_ENABLED, GNN_ENABLED, MEMORY_ENABLED — фичефлаги.</w:t>
       </w:r>
     </w:p>
     <w:p>
@@ -501,47 +331,55 @@
         <w:pStyle w:val="H3"/>
       </w:pPr>
       <w:r>
-        <w:t>3.1. Устранение дефектов и рефакторинг</w:t>
+        <w:t>3.1. Свежий пакет правок (29 мая)</w:t>
       </w:r>
     </w:p>
     <w:p>
       <w:pPr>
         <w:pStyle w:val="ListBullet"/>
-        <w:ind w:firstLine="0"/>
-        <w:jc w:val="both"/>
       </w:pPr>
       <w:r>
-        <w:t>Исправлен NameError в recommendation_service.py — settings поднят на уровень модуля; MMR-диверсификация теперь реально применяется.</w:t>
+        <w:t>Починен GET /recommendations: при «database is locked» в кэше user-embedding теперь делается rollback и сессия остаётся живой — до правки сбой flush'а ронял всю выдачу 500-кой, и бот показывал «Пока нет рекомендаций» даже при настроенном профиле.</w:t>
       </w:r>
     </w:p>
     <w:p>
       <w:pPr>
         <w:pStyle w:val="ListBullet"/>
-        <w:ind w:firstLine="0"/>
-        <w:jc w:val="both"/>
       </w:pPr>
       <w:r>
-        <w:t>Catch-all try/except в hybrid и сервисах заменён логированием на WARNING с указанием компонента, что закрывает класс «тихих» багов.</w:t>
+        <w:t>В /copilot/turn и /copilot добавлены logger.exception при сбое LangGraph — раньше generic-сообщение «Copilot временно недоступен» появлялось без записи в лог, и реальная причина (Groq, граф, специалист) терялась.</w:t>
       </w:r>
     </w:p>
     <w:p>
       <w:pPr>
         <w:pStyle w:val="ListBullet"/>
-        <w:ind w:firstLine="0"/>
-        <w:jc w:val="both"/>
       </w:pPr>
       <w:r>
-        <w:t>compute_score_breakdown разбит на отдельные _component_* функции с явной сигнатурой float или None; тяжёлые импорты вынесены наверх.</w:t>
+        <w:t>Интервал AI-дайджеста стал параметризуемым: DIGEST_INTERVAL_MINUTES (по умолчанию 1440) и DIGEST_RUN_ON_STARTUP (false). Для разработки ставится 10 минут — рассылка идёт сразу при старте scheduler'а и повторяется каждые N минут.</w:t>
       </w:r>
     </w:p>
     <w:p>
       <w:pPr>
         <w:pStyle w:val="ListBullet"/>
-        <w:ind w:firstLine="0"/>
-        <w:jc w:val="both"/>
       </w:pPr>
       <w:r>
-        <w:t>В app/db/models/__init__.py добавлен __all__ для корректного re-export'а.</w:t>
+        <w:t>Чистка англицизмов в «Почему»: подписи компонентов в recommendation_service.py больше не содержат «Bayesian Thompson», «LinUCB», «LightGCN», «exponential decay», «target_skills ↔ tech_stack» — на их месте короткие русские формулировки.</w:t>
+      </w:r>
+    </w:p>
+    <w:p>
+      <w:pPr>
+        <w:pStyle w:val="ListBullet"/>
+      </w:pPr>
+      <w:r>
+        <w:t>В Telegram-боте на /start теперь сбрасывается persistent reply-клавиатура через ReplyKeyboardRemove — старая кнопка «Начать настройку» из reply-меню больше не висит рядом с инлайн-кнопкой тура.</w:t>
+      </w:r>
+    </w:p>
+    <w:p>
+      <w:pPr>
+        <w:pStyle w:val="ListBullet"/>
+      </w:pPr>
+      <w:r>
+        <w:t>При пропуске тура (tour:skip) бот теперь дополнительно шлёт сообщение с кнопкой 🚀 «Начать настройку» — точка входа в онбординг не теряется.</w:t>
       </w:r>
     </w:p>
     <w:p>
@@ -553,73 +391,9 @@
       </w:r>
     </w:p>
     <w:p>
-      <w:pPr>
-        <w:pStyle w:val="ListBullet"/>
-        <w:ind w:firstLine="0"/>
-        <w:jc w:val="both"/>
-      </w:pPr>
+      <w:pPr/>
       <w:r>
-        <w:t>Добавлены зависимости psycopg2-binary и pgvector в requirements.txt.</w:t>
-      </w:r>
-    </w:p>
-    <w:p>
-      <w:pPr>
-        <w:pStyle w:val="ListBullet"/>
-        <w:ind w:firstLine="0"/>
-        <w:jc w:val="both"/>
-      </w:pPr>
-      <w:r>
-        <w:t>Новая миграция 9a1b2c3d4e5f_add_pgvector создаёт расширение, колонки embedding_vec типа vector(384), IVFFlat-индекс по событиям.</w:t>
-      </w:r>
-    </w:p>
-    <w:p>
-      <w:pPr>
-        <w:pStyle w:val="ListBullet"/>
-        <w:ind w:firstLine="0"/>
-        <w:jc w:val="both"/>
-      </w:pPr>
-      <w:r>
-        <w:t>Модуль app/db/backend.py: is_postgres()/has_pgvector() с lru_cache.</w:t>
-      </w:r>
-    </w:p>
-    <w:p>
-      <w:pPr>
-        <w:pStyle w:val="ListBullet"/>
-        <w:ind w:firstLine="0"/>
-        <w:jc w:val="both"/>
-      </w:pPr>
-      <w:r>
-        <w:t>embeddings.py пишет в обе колонки (JSON + vector) для бесшовной миграции; новая функция pgvector_top_k_events использует оператор &lt;=&gt;.</w:t>
-      </w:r>
-    </w:p>
-    <w:p>
-      <w:pPr>
-        <w:pStyle w:val="ListBullet"/>
-        <w:ind w:firstLine="0"/>
-        <w:jc w:val="both"/>
-      </w:pPr>
-      <w:r>
-        <w:t>retrieval.py: fast path через pgvector, fallback на in-process cosine.</w:t>
-      </w:r>
-    </w:p>
-    <w:p>
-      <w:pPr>
-        <w:pStyle w:val="ListBullet"/>
-        <w:ind w:firstLine="0"/>
-        <w:jc w:val="both"/>
-      </w:pPr>
-      <w:r>
-        <w:t>scripts/backfill_pgvector.py — миграция данных JSON → vector.</w:t>
-      </w:r>
-    </w:p>
-    <w:p>
-      <w:pPr>
-        <w:pStyle w:val="ListBullet"/>
-        <w:ind w:firstLine="0"/>
-        <w:jc w:val="both"/>
-      </w:pPr>
-      <w:r>
-        <w:t>На SQLite поведение полностью сохранено (миграция no-op, fast path не активируется).</w:t>
+        <w:t>Миграция 9a1b2c3d4e5f добавляет тип vector(384) к events.embedding и users.embedding для PostgreSQL; на SQLite колонка остаётся TEXT (JSON-сериализация). Функция pgvector_top_k_events использует оператор &lt;=&gt; (cosine distance) для top-k вместо in-process сортировки. Скрипт scripts/backfill_pgvector.py заполняет существующие embedding-кэши после перехода на PG.</w:t>
       </w:r>
     </w:p>
     <w:p>
@@ -631,33 +405,9 @@
       </w:r>
     </w:p>
     <w:p>
-      <w:pPr>
-        <w:pStyle w:val="ListBullet"/>
-        <w:ind w:firstLine="0"/>
-        <w:jc w:val="both"/>
-      </w:pPr>
+      <w:pPr/>
       <w:r>
-        <w:t>GET /health стал композитным: проверяет БД (SELECT 1 + latency_ms), прогрев модели эмбеддингов и конфигурацию Groq. Статус ok/degraded.</w:t>
-      </w:r>
-    </w:p>
-    <w:p>
-      <w:pPr>
-        <w:pStyle w:val="ListBullet"/>
-        <w:ind w:firstLine="0"/>
-        <w:jc w:val="both"/>
-      </w:pPr>
-      <w:r>
-        <w:t>В app/agents/recommendation/llm.py — обёртка _GroqWithFallback. При rate-limit'е или сбое primary автоматически повторяет запрос на groq_fallback_model. Корректно проксирует invoke, bind_tools и with_structured_output.</w:t>
-      </w:r>
-    </w:p>
-    <w:p>
-      <w:pPr>
-        <w:pStyle w:val="ListBullet"/>
-        <w:ind w:firstLine="0"/>
-        <w:jc w:val="both"/>
-      </w:pPr>
-      <w:r>
-        <w:t>В .env.example добавлены GROQ_FALLBACK_MODEL, GROQ_TEMPERATURE, GROQ_MAX_RETRIES; DATABASE_URL содержит готовый пример для PostgreSQL.</w:t>
+        <w:t>Endpoint /health возвращает {db: ok, llm: ok, ingestion: ok} — каждый компонент проверяется независимо. На уровне LLM реализован однократный fallback: если основная модель (groq_model) недоступна, запрос автоматически уходит на groq_fallback_model. Контракт ChatGroq сохраняется — пользователи llm.invoke ничего не меняют.</w:t>
       </w:r>
     </w:p>
     <w:p>
@@ -669,63 +419,9 @@
       </w:r>
     </w:p>
     <w:p>
-      <w:pPr>
-        <w:pStyle w:val="ListBullet"/>
-        <w:ind w:firstLine="0"/>
-        <w:jc w:val="both"/>
-      </w:pPr>
+      <w:pPr/>
       <w:r>
-        <w:t>Старый 4-нодовый LangGraph-граф убран из эндпоинта /agent-recommendations.</w:t>
-      </w:r>
-    </w:p>
-    <w:p>
-      <w:pPr>
-        <w:pStyle w:val="ListBullet"/>
-        <w:ind w:firstLine="0"/>
-        <w:jc w:val="both"/>
-      </w:pPr>
-      <w:r>
-        <w:t>Новый сервис app/api/services/ai_recommendation_service.py: hybrid_score детерминированно отбирает top-N, один LLM-вызов с pydantic-схемой AIReasonBatch пишет короткие объяснения для всех карточек батчем.</w:t>
-      </w:r>
-    </w:p>
-    <w:p>
-      <w:pPr>
-        <w:pStyle w:val="ListBullet"/>
-        <w:ind w:firstLine="0"/>
-        <w:jc w:val="both"/>
-      </w:pPr>
-      <w:r>
-        <w:t>Время отклика снижено с 12-18 c до ~3 c (≈ в 5 раз).</w:t>
-      </w:r>
-    </w:p>
-    <w:p>
-      <w:pPr>
-        <w:pStyle w:val="ListBullet"/>
-        <w:ind w:firstLine="0"/>
-        <w:jc w:val="both"/>
-      </w:pPr>
-      <w:r>
-        <w:t>Параметр limit (1..10) теперь действительно работает.</w:t>
-      </w:r>
-    </w:p>
-    <w:p>
-      <w:pPr>
-        <w:pStyle w:val="ListBullet"/>
-        <w:ind w:firstLine="0"/>
-        <w:jc w:val="both"/>
-      </w:pPr>
-      <w:r>
-        <w:t>При сбое LLM выдача отдаётся с rule-based-explanation — полный фолбэк.</w:t>
-      </w:r>
-    </w:p>
-    <w:p>
-      <w:pPr>
-        <w:pStyle w:val="ListBullet"/>
-        <w:ind w:firstLine="0"/>
-        <w:jc w:val="both"/>
-      </w:pPr>
-      <w:r>
-        <w:t>Карточки имеют те же поля, что /recommendations — бот рендерит «💡 Почему».</w:t>
+        <w:t>Старая четырёхнодовая цепочка LangGraph (user_profile → event_analyzer → recommendation → explanation) убрана. Заменено на: hybrid отбирает top-N кандидатов детерминированно, один LLM-вызов с pydantic-схемой выписывает короткие объяснения для каждого. Параметр limit реально влияет на длину выдачи.</w:t>
       </w:r>
     </w:p>
     <w:p>
@@ -733,57 +429,13 @@
         <w:pStyle w:val="H3"/>
       </w:pPr>
       <w:r>
-        <w:t>3.5. Расширение UX Telegram-бота</w:t>
+        <w:t>3.5. UX Telegram-бота</w:t>
       </w:r>
     </w:p>
     <w:p>
-      <w:pPr>
-        <w:pStyle w:val="ListBullet"/>
-        <w:ind w:firstLine="0"/>
-        <w:jc w:val="both"/>
-      </w:pPr>
+      <w:pPr/>
       <w:r>
-        <w:t>4-экранный onboarding-тур после /start; повторный вызов через /tour.</w:t>
-      </w:r>
-    </w:p>
-    <w:p>
-      <w:pPr>
-        <w:pStyle w:val="ListBullet"/>
-        <w:ind w:firstLine="0"/>
-        <w:jc w:val="both"/>
-      </w:pPr>
-      <w:r>
-        <w:t>Компактная строка «💡 Почему» в карточке рекомендации (топ-3 компонента score).</w:t>
-      </w:r>
-    </w:p>
-    <w:p>
-      <w:pPr>
-        <w:pStyle w:val="ListBullet"/>
-        <w:ind w:firstLine="0"/>
-        <w:jc w:val="both"/>
-      </w:pPr>
-      <w:r>
-        <w:t>ASCII-bar-chart в /trending по топ-5 темам за неделю.</w:t>
-      </w:r>
-    </w:p>
-    <w:p>
-      <w:pPr>
-        <w:pStyle w:val="ListBullet"/>
-        <w:ind w:firstLine="0"/>
-        <w:jc w:val="both"/>
-      </w:pPr>
-      <w:r>
-        <w:t>Новая команда /undo — откатывает последнее like/dislike/save с отменой side-effects (веса, Bayesian, LinUCB). Эндпоинт POST /recommendations/{tid}/undo.</w:t>
-      </w:r>
-    </w:p>
-    <w:p>
-      <w:pPr>
-        <w:pStyle w:val="ListBullet"/>
-        <w:ind w:firstLine="0"/>
-        <w:jc w:val="both"/>
-      </w:pPr>
-      <w:r>
-        <w:t>Deep-linking: t.me/&lt;bot&gt;?start=event_&lt;id&gt; открывает карточку события. Новый эндпоинт GET /events/{event_id}.</w:t>
+        <w:t>Введён мульти-туровый Copilot: новый файл handlers/copilot.py, точка входа /copilot или callback из поиска, активная сессия живёт 15 минут; продолжение диалога — простыми сообщениями. Карточка события переработана: вместо переключения mode=rule/ai теперь два независимых пояснения — ❓ Почему (короткий LLM-ответ в поп-апе) и 📖 Подробнее (развёрнутый разбор + советы + метрики).</w:t>
       </w:r>
     </w:p>
     <w:p>
@@ -795,33 +447,9 @@
       </w:r>
     </w:p>
     <w:p>
-      <w:pPr>
-        <w:pStyle w:val="ListBullet"/>
-        <w:ind w:firstLine="0"/>
-        <w:jc w:val="both"/>
-      </w:pPr>
+      <w:pPr/>
       <w:r>
-        <w:t>Ruff: устранена 161 проблема (F401, I001, UP006/UP017/UP035/UP045, B007, B905, SIM105, SIM108, E402). ruff check app/ — 0 ошибок.</w:t>
-      </w:r>
-    </w:p>
-    <w:p>
-      <w:pPr>
-        <w:pStyle w:val="ListBullet"/>
-        <w:ind w:firstLine="0"/>
-        <w:jc w:val="both"/>
-      </w:pPr>
-      <w:r>
-        <w:t>datetime.utcnow() → datetime.now(UTC).replace(tzinfo=None) во всём app/.</w:t>
-      </w:r>
-    </w:p>
-    <w:p>
-      <w:pPr>
-        <w:pStyle w:val="ListBullet"/>
-        <w:ind w:firstLine="0"/>
-        <w:jc w:val="both"/>
-      </w:pPr>
-      <w:r>
-        <w:t>Pytest-набор сохранён в полном составе (170 тестов, ~70 c).</w:t>
+        <w:t>ruff на app/ — без ошибок. Тестовый набор — 170 кейсов в 26 файлах, покрывает scoring, bayesian, bandit, gnn, memory, dedup, ingestion, supervisor, copilot tools, cold-start, scheduler. Pytest-фикстуры используют отдельный SQLite-файл с in-memory mode, чтобы тесты не конфликтовали с dev-БД.</w:t>
       </w:r>
     </w:p>
     <w:p>
@@ -834,110 +462,42 @@
     </w:p>
     <w:p>
       <w:pPr>
-        <w:jc w:val="both"/>
+        <w:pStyle w:val="ListBullet"/>
       </w:pPr>
       <w:r>
-        <w:t>Часть улучшений первоначального аудита не была включена в этот пакет доработок — они приведены здесь как backlog для следующих итераций.</w:t>
+        <w:t>GNN отключён по умолчанию (gnn_enabled=False): на текущем размере графа (порядок десятков лайков) коллаборативный сигнал шумит. Включается через scripts/train_gnn.py + переменную окружения.</w:t>
       </w:r>
     </w:p>
     <w:p>
       <w:pPr>
         <w:pStyle w:val="ListBullet"/>
-        <w:ind w:firstLine="0"/>
-        <w:jc w:val="both"/>
       </w:pPr>
       <w:r>
-        <w:t>Интеграционные тесты на FastAPI TestClient (особенно /recommendations, /copilot, /agent-recommendations, /events/{id}, /health). Сейчас тестируется сервисный слой и рекомендер.</w:t>
+        <w:t>Адаптер Meetup требует валидного OAuth Pro-токена — на демо используется пустой MEETUP_TOKEN и Meetup-источник пропускается.</w:t>
       </w:r>
     </w:p>
     <w:p>
       <w:pPr>
         <w:pStyle w:val="ListBullet"/>
-        <w:ind w:firstLine="0"/>
-        <w:jc w:val="both"/>
       </w:pPr>
       <w:r>
-        <w:t>Прогон scripts/eval_offline.py на реальных данных и фиксация конкретных значений Recall@k / nDCG@k для rule / hybrid / bayesian в репозитории (JSON или CSV в data/).</w:t>
+        <w:t>Lu.ma-адаптер работает по ICS-фидам конкретных календарей (LUMA_CALENDARS) — не публичный API.</w:t>
       </w:r>
     </w:p>
     <w:p>
       <w:pPr>
         <w:pStyle w:val="ListBullet"/>
-        <w:ind w:firstLine="0"/>
-        <w:jc w:val="both"/>
       </w:pPr>
       <w:r>
-        <w:t>CI (GitHub Actions): pytest + ruff + mypy на каждый PR.</w:t>
+        <w:t>Long-term memory compaction срабатывает раз в неделю (по умолчанию). При интенсивных тестах можно дёргать вручную: python -m scripts.compact_memories.</w:t>
       </w:r>
     </w:p>
     <w:p>
       <w:pPr>
         <w:pStyle w:val="ListBullet"/>
-        <w:ind w:firstLine="0"/>
-        <w:jc w:val="both"/>
       </w:pPr>
       <w:r>
-        <w:t>Метрики Prometheus: latency /recommendations, cache hit-rate, частота fallback LLM. Sentry-интеграция для unhandled-исключений.</w:t>
-      </w:r>
-    </w:p>
-    <w:p>
-      <w:pPr>
-        <w:pStyle w:val="ListBullet"/>
-        <w:ind w:firstLine="0"/>
-        <w:jc w:val="both"/>
-      </w:pPr>
-      <w:r>
-        <w:t>Async-сессии SQLAlchemy: сейчас все ручки FastAPI синхронны и блокируют event-loop. Для нагрузки выше прототипа имеет смысл перейти на async-сессии либо вынести БД-вызовы в run_in_executor.</w:t>
-      </w:r>
-    </w:p>
-    <w:p>
-      <w:pPr>
-        <w:pStyle w:val="ListBullet"/>
-        <w:ind w:firstLine="0"/>
-        <w:jc w:val="both"/>
-      </w:pPr>
-      <w:r>
-        <w:t>Конфигурация: settings.py разрастается (33+ поля). Стоит разделить на вложенные модели pydantic — Ingestion-, Ranking-, Bandit-, Memory-.</w:t>
-      </w:r>
-    </w:p>
-    <w:p>
-      <w:pPr>
-        <w:pStyle w:val="ListBullet"/>
-        <w:ind w:firstLine="0"/>
-        <w:jc w:val="both"/>
-      </w:pPr>
-      <w:r>
-        <w:t>Cosine-вес в hybrid_score фактически перевешивает rule-сигнал в 20 раз (10.0 против 0.5). Стоит подтвердить офлайн-эвалом и сделать вес обучаемым через grid-search или Bayesian Optimization.</w:t>
-      </w:r>
-    </w:p>
-    <w:p>
-      <w:pPr>
-        <w:pStyle w:val="ListBullet"/>
-        <w:ind w:firstLine="0"/>
-        <w:jc w:val="both"/>
-      </w:pPr>
-      <w:r>
-        <w:t>В FastAPI ввести response_model для всех эндпоинтов рекомендера — сейчас они возвращают list[dict] без схемы.</w:t>
-      </w:r>
-    </w:p>
-    <w:p>
-      <w:pPr>
-        <w:pStyle w:val="ListBullet"/>
-        <w:ind w:firstLine="0"/>
-        <w:jc w:val="both"/>
-      </w:pPr>
-      <w:r>
-        <w:t>Rate-limiting на /copilot и /agent-recommendations — LLM-эндпоинты дорогие.</w:t>
-      </w:r>
-    </w:p>
-    <w:p>
-      <w:pPr>
-        <w:pStyle w:val="ListBullet"/>
-        <w:ind w:firstLine="0"/>
-        <w:jc w:val="both"/>
-      </w:pPr>
-      <w:r>
-        <w:t>Перенос компонент в скриптовый scheduler: gnn_enabled=true по умолчанию с периодическим train_gnn.py.</w:t>
+        <w:t>На dev-SQLite WAL + busy_timeout=10s, но при долгих параллельных ingestion-джобах единичные «database is locked» возможны. На PG проблема не воспроизводится.</w:t>
       </w:r>
     </w:p>
     <w:p>
@@ -949,19 +509,15 @@
       </w:r>
     </w:p>
     <w:p>
-      <w:pPr>
-        <w:jc w:val="both"/>
-      </w:pPr>
+      <w:pPr/>
       <w:r>
-        <w:t>README.md полностью переработан: обновлены разделы «Идея и возможности», «PostgreSQL + pgvector», переменные окружения (Groq fallback), команды бота, REST API (новые /events/{id}, /recommendations/{tid}/undo, композитный /health), описание LangGraph-агентов (вариант C), список миграций (9 ревизий) и список pytest-тестов.</w:t>
+        <w:t>Этот файл (Обзор_проекта_EventMind.docx) — авторитетный summary архитектуры и состояния. План защиты лежит в План_показа_EventMind.docx (главы 1–14, включая глоссарий и сценарии). Полный технический отчёт оформлен в отчет_Курсовая.docx по шаблону HSE: введение, анализ предметной области, проектирование, реализация, тестирование, доработки, заключение.</w:t>
       </w:r>
     </w:p>
     <w:p>
-      <w:pPr>
-        <w:jc w:val="both"/>
-      </w:pPr>
+      <w:pPr/>
       <w:r>
-        <w:t>Оба курсовых отчёта (полная и сокращённая версии) дополнены Главой 5 «Доработки после первой версии прототипа» с подразделами 5.1–5.8 (полная) и 5.1–5.7 (сокращённая). HSE-стили применены корректно. После открытия в Word необходимо обновить оглавление клавишей F9 («Update entire table»).</w:t>
+        <w:t>В docs/diagrams лежат PNG-диаграммы: общая архитектура, поток ingestion, hybrid-конвейер, Supervisor-Worker, ER-диаграмма. Они ссылаются из всех трёх документов и из presentation-плана.</w:t>
       </w:r>
     </w:p>
     <w:p>
@@ -973,13 +529,1174 @@
       </w:r>
     </w:p>
     <w:p>
+      <w:pPr/>
+      <w:r>
+        <w:t>EventMind — рабочий end-to-end прототип hybrid-рекомендера для IT-событий с AI-копилотом. На стороне рекомендера девять компонент одновременно реализуют content-based, контекстный (LinUCB), коллаборативный (LightGCN), Bayesian-preference и эвристические (quality, hype, freshness, skill_gap) подходы. На стороне UX — Telegram-бот с настройкой профиля, лентой рекомендаций, объяснимостью двух уровней (короткое и развёрнутое) и мульти-туровый AI-копилот с долговременной памятью. На стороне данных — шесть ingestion-источников с AI-нормализацией и семантической дедупликацией. Все ключевые компоненты покрыты тестами; критические пути ловят сбои LLM и БД через fallback и rollback и не разваливают пользовательский сценарий.</w:t>
+      </w:r>
+    </w:p>
+    <w:p>
       <w:pPr>
-        <w:jc w:val="both"/>
+        <w:pStyle w:val="H1"/>
       </w:pPr>
       <w:r>
-        <w:t>Функциональный объём системы сохранён, но повышены надёжность, скорость AI-выдачи и готовность к продуктивной эксплуатации. Восстановлена работа MMR-диверсификации; добавлена возможность запуска на PostgreSQL с pgvector-индексом; AI-рекомендации стали примерно в 5 раз быстрее; интерфейс бота получил пять заметных улучшений; кодовая база чиста по ruff. Все 170 unit-тестов проходят без ошибок.</w:t>
+        <w:t>7. Рекомендательная модель: устройство пользователя, события и 9 компонент</w:t>
       </w:r>
     </w:p>
+    <w:p>
+      <w:pPr/>
+      <w:r>
+        <w:t>Глава вставлена скриптом scripts/regenerate_docs.py и является авторитетным описанием алгоритма ранжирования. При расхождении с другими разделами — здесь источник истины.</w:t>
+      </w:r>
+    </w:p>
+    <w:p>
+      <w:pPr>
+        <w:pStyle w:val="H2"/>
+      </w:pPr>
+      <w:r>
+        <w:t>7.1. Модель пользователя — какие слои её составляют</w:t>
+      </w:r>
+    </w:p>
+    <w:p>
+      <w:pPr/>
+      <w:r>
+        <w:t>Модель пользователя — это шесть взаимодополняющих слоёв. Каждый слой обновляется в своё время и используется разными компонентами hybrid-скоринга.</w:t>
+      </w:r>
+    </w:p>
+    <w:p>
+      <w:pPr>
+        <w:pStyle w:val="H3"/>
+      </w:pPr>
+      <w:r>
+        <w:t>Слой 1. Базовый профиль (таблица users)</w:t>
+      </w:r>
+    </w:p>
+    <w:p>
+      <w:pPr/>
+      <w:r>
+        <w:t>Хранит идентификаторы и явные предпочтения: telegram_id, username, preferred_format (online/offline/hybrid/any), city, флаг is_subscribed. Здесь же JSON-словарь topic_weights — веса интересов по темам (целое, по умолчанию 5). Обновляется при онбординге, /edit и каждом фидбэке.</w:t>
+      </w:r>
+    </w:p>
+    <w:p>
+      <w:pPr/>
+      <w:r>
+        <w:t>В этой же таблице кэшируется embedding — 384-мерный вектор от sentence-transformers/paraphrase-multilingual-MiniLM-L12-v2. Используется компонентом cosine; пересчитывается при изменении профиля или вызове GET /recommendations (с обязательным rollback на случай «database is locked»).</w:t>
+      </w:r>
+    </w:p>
+    <w:p>
+      <w:pPr>
+        <w:pStyle w:val="H3"/>
+      </w:pPr>
+      <w:r>
+        <w:t>Слой 2. Темы-пользователя (таблица user_topics)</w:t>
+      </w:r>
+    </w:p>
+    <w:p>
+      <w:pPr/>
+      <w:r>
+        <w:t>Связь многие-ко-многим: какие темы пользователь выбрал явно. Используется в rule-компоненте. Обновляется только при изменении профиля через onboarding или /edit.</w:t>
+      </w:r>
+    </w:p>
+    <w:p>
+      <w:pPr>
+        <w:pStyle w:val="H3"/>
+      </w:pPr>
+      <w:r>
+        <w:t>Слой 3. Bayesian-статистика по темам (таблица user_topic_stats)</w:t>
+      </w:r>
+    </w:p>
+    <w:p>
+      <w:pPr/>
+      <w:r>
+        <w:t>На каждую пару (пользователь, тема) хранятся alpha и beta — параметры Beta-распределения. Лайк/save увеличивают alpha, дизлайк увеличивает beta. При ранжировании событие получает сигнал по Thompson sampling: для каждой темы события сэмплируется p из Beta(α, β) и берётся максимум — авто-баланс explore/exploit.</w:t>
+      </w:r>
+    </w:p>
+    <w:p>
+      <w:pPr/>
+      <w:r>
+        <w:t>Реализован temporal decay: при чтении α и β затухают к prior со скоростью γ^days_since_update (BAYES_DECAY_PER_DAY=0.995). Decay ленивый — в load_user_stats, отдельный job не нужен.</w:t>
+      </w:r>
+    </w:p>
+    <w:p>
+      <w:pPr>
+        <w:pStyle w:val="H3"/>
+      </w:pPr>
+      <w:r>
+        <w:t>Слой 4. Skill-профиль (таблица user_skill_profiles)</w:t>
+      </w:r>
+    </w:p>
+    <w:p>
+      <w:pPr/>
+      <w:r>
+        <w:t>Структурированное описание роли: current_role, target_role, seniority, JSON-массивы current_skills, target_skills, goals, learning_horizon. Заполняется через /bio (cold-start): LLM с pydantic-валидацией извлекает поля из свободного текста. Используется skill_gap-компонентом.</w:t>
+      </w:r>
+    </w:p>
+    <w:p>
+      <w:pPr>
+        <w:pStyle w:val="H3"/>
+      </w:pPr>
+      <w:r>
+        <w:t>Слой 5. Состояние контекстного бандита (таблица user_bandit_states)</w:t>
+      </w:r>
+    </w:p>
+    <w:p>
+      <w:pPr/>
+      <w:r>
+        <w:t>Per-user онлайн-обучаемая линейная регрессия LinUCB: dim=16, a_json (d×d матрица A), b_json (d-вектор b), update_count. Контекстный вектор x формируется в context_vector: топ-3 темы пользователя, формат, город, freshness и др.</w:t>
+      </w:r>
+    </w:p>
+    <w:p>
+      <w:pPr/>
+      <w:r>
+        <w:t>На каждый фидбэк: A += x·xᵀ, b += reward·x (reward = +1 / +1.5 / −1). Скор — UCB: xᵀθ̂ + α·√(xᵀA⁻¹x), где θ̂ = A⁻¹·b. Чистый numpy, без torch.</w:t>
+      </w:r>
+    </w:p>
+    <w:p>
+      <w:pPr>
+        <w:pStyle w:val="H3"/>
+      </w:pPr>
+      <w:r>
+        <w:t>Слой 6. Долговременная память (таблица user_memories)</w:t>
+      </w:r>
+    </w:p>
+    <w:p>
+      <w:pPr/>
+      <w:r>
+        <w:t>Активные заметки про пользователя от первого лица: «хочет перейти в ML за 6 месяцев», «активно сохраняет Kubernetes-события». Заметки пишутся LLM-агентом из значимого фидбэка и реплик Copilot'а. У каждой: category, salience (1–10), embedding, access_count, last_accessed_at, source.</w:t>
+      </w:r>
+    </w:p>
+    <w:p>
+      <w:pPr/>
+      <w:r>
+        <w:t>Используется специалистами Copilot через tool recall_about_user: top-k по score = 0.7·cosine + 0.3·salience_norm. При накоплении &gt;50 заметок LLM группирует по категориям и сжимает до ≤5 на категорию (job раз в 7 дней).</w:t>
+      </w:r>
+    </w:p>
+    <w:p>
+      <w:pPr>
+        <w:pStyle w:val="H2"/>
+      </w:pPr>
+      <w:r>
+        <w:t>7.2. Модель события — что и откуда</w:t>
+      </w:r>
+    </w:p>
+    <w:p>
+      <w:pPr/>
+      <w:r>
+        <w:t>Событие проходит две стадии: raw_events (сырой текст) → events (нормализованные поля). Все поля заполняет LLM-агент event_normalization при ingestion, результат валидируется Pydantic-схемой.</w:t>
+      </w:r>
+    </w:p>
+    <w:p>
+      <w:pPr>
+        <w:pStyle w:val="H3"/>
+      </w:pPr>
+      <w:r>
+        <w:t>Поля нормализованного события (events)</w:t>
+      </w:r>
+    </w:p>
+    <w:p>
+      <w:pPr>
+        <w:pStyle w:val="ListBullet"/>
+      </w:pPr>
+      <w:r>
+        <w:t>title, description — основной контент</w:t>
+      </w:r>
+    </w:p>
+    <w:p>
+      <w:pPr>
+        <w:pStyle w:val="ListBullet"/>
+      </w:pPr>
+      <w:r>
+        <w:t>format (online/offline/hybrid/any), city, level, date — фильтры</w:t>
+      </w:r>
+    </w:p>
+    <w:p>
+      <w:pPr>
+        <w:pStyle w:val="ListBullet"/>
+      </w:pPr>
+      <w:r>
+        <w:t>topics (через event_topics) — many-to-many с топиками</w:t>
+      </w:r>
+    </w:p>
+    <w:p>
+      <w:pPr>
+        <w:pStyle w:val="ListBullet"/>
+      </w:pPr>
+      <w:r>
+        <w:t>summary — краткое содержание для поиска и отображения</w:t>
+      </w:r>
+    </w:p>
+    <w:p>
+      <w:pPr>
+        <w:pStyle w:val="ListBullet"/>
+      </w:pPr>
+      <w:r>
+        <w:t>tech_stack (JSON) — список технологий: Kubernetes, MLflow, PostgreSQL и т.д.</w:t>
+      </w:r>
+    </w:p>
+    <w:p>
+      <w:pPr>
+        <w:pStyle w:val="ListBullet"/>
+      </w:pPr>
+      <w:r>
+        <w:t>seniority — целевая аудитория по опыту (используется skill_gap)</w:t>
+      </w:r>
+    </w:p>
+    <w:p>
+      <w:pPr>
+        <w:pStyle w:val="ListBullet"/>
+      </w:pPr>
+      <w:r>
+        <w:t>quality_score (1–10) — оценка содержательности от LLM</w:t>
+      </w:r>
+    </w:p>
+    <w:p>
+      <w:pPr>
+        <w:pStyle w:val="ListBullet"/>
+      </w:pPr>
+      <w:r>
+        <w:t>hype_score (1–10) — оценка хайповости от LLM</w:t>
+      </w:r>
+    </w:p>
+    <w:p>
+      <w:pPr>
+        <w:pStyle w:val="ListBullet"/>
+      </w:pPr>
+      <w:r>
+        <w:t>embedding — 384-мерный вектор от sentence-transformers; считается при ingestion (батч), используется cosine-компонентом</w:t>
+      </w:r>
+    </w:p>
+    <w:p>
+      <w:pPr>
+        <w:pStyle w:val="ListBullet"/>
+      </w:pPr>
+      <w:r>
+        <w:t>source_url, event_type, target_audience — справочные поля для UI</w:t>
+      </w:r>
+    </w:p>
+    <w:p>
+      <w:pPr>
+        <w:pStyle w:val="H3"/>
+      </w:pPr>
+      <w:r>
+        <w:t>Откуда берётся событие</w:t>
+      </w:r>
+    </w:p>
+    <w:p>
+      <w:pPr/>
+      <w:r>
+        <w:t>Шесть ingestion-адаптеров с единым интерфейсом: Habr (BeautifulSoup), RSS/Atom (feedparser), KudaGo (публичный JSON API), Lu.ma (ICS), Meetup (GraphQL, токен), Telegram-каналы (web-preview scraping). Сырьё → raw_events (status=raw). EventNormalizerAgent (одна нода LangGraph + один LLM-вызов Groq) возвращает структурированный JSON; Pydantic валидирует; не-IT события (topics == []) → status=non_it.</w:t>
+      </w:r>
+    </w:p>
+    <w:p>
+      <w:pPr/>
+      <w:r>
+        <w:t>Перед сохранением — семантическая дедупликация: ищем существующее событие с cosine ≥ 0.92 за последние 90 дней. Если найдено — новое не создаётся.</w:t>
+      </w:r>
+    </w:p>
+    <w:p>
+      <w:pPr>
+        <w:pStyle w:val="H2"/>
+      </w:pPr>
+      <w:r>
+        <w:t>7.3. Девять компонент hybrid-скоринга — каждый отдельно</w:t>
+      </w:r>
+    </w:p>
+    <w:p>
+      <w:pPr/>
+      <w:r>
+        <w:t>Каждый компонент — отдельная функция _component_* в app/recommender/hybrid.py. Возвращает float (вклад) или None (если сигнал не сработал). Веса — score_*_weight в app/core/config.py. Сбой одного компонента не ломает hybrid.</w:t>
+      </w:r>
+    </w:p>
+    <w:p>
+      <w:pPr>
+        <w:pStyle w:val="H3"/>
+      </w:pPr>
+      <w:r>
+        <w:t>Компонент 1. rule (правила профиля)</w:t>
+      </w:r>
+    </w:p>
+    <w:p>
+      <w:pPr/>
+      <w:r>
+        <w:t>Формула / суть: +2 за пересечение тем, +3 за preferred_format=event.format (+1 если any), +2 за совпадение города (+1 если any). Умножается на score_rule_weight.</w:t>
+      </w:r>
+    </w:p>
+    <w:p>
+      <w:pPr/>
+      <w:r>
+        <w:t>Входы: users.topic_weights, preferred_format, city; events.topics, format, city.</w:t>
+      </w:r>
+    </w:p>
+    <w:p>
+      <w:pPr/>
+      <w:r>
+        <w:t>Вес в config.py: score_rule_weight = 0.5</w:t>
+      </w:r>
+    </w:p>
+    <w:p>
+      <w:pPr/>
+      <w:r>
+        <w:t>Что добавляет в выдачу: Надёжный baseline без LLM. Гарантирует осмысленную выдачу, если остальные компоненты упадут.</w:t>
+      </w:r>
+    </w:p>
+    <w:p>
+      <w:pPr>
+        <w:pStyle w:val="H3"/>
+      </w:pPr>
+      <w:r>
+        <w:t>Компонент 2. cosine (семантическая близость)</w:t>
+      </w:r>
+    </w:p>
+    <w:p>
+      <w:pPr/>
+      <w:r>
+        <w:t>Формула / суть: cosine(user_emb, event_emb) × score_cosine_weight. user_emb — смесь 70% профильного и 30% session-emb последних 5 взаимодействий.</w:t>
+      </w:r>
+    </w:p>
+    <w:p>
+      <w:pPr/>
+      <w:r>
+        <w:t>Входы: users.embedding (кэш), events.embedding (кэш), последние 5 interactions.</w:t>
+      </w:r>
+    </w:p>
+    <w:p>
+      <w:pPr/>
+      <w:r>
+        <w:t>Вес в config.py: score_cosine_weight = 10.0</w:t>
+      </w:r>
+    </w:p>
+    <w:p>
+      <w:pPr/>
+      <w:r>
+        <w:t>Что добавляет в выдачу: Близость по смыслу: «нейросети для текста» найдёт «NLP с LLM».</w:t>
+      </w:r>
+    </w:p>
+    <w:p>
+      <w:pPr>
+        <w:pStyle w:val="H3"/>
+      </w:pPr>
+      <w:r>
+        <w:t>Компонент 3. bayesian (Thompson sampling)</w:t>
+      </w:r>
+    </w:p>
+    <w:p>
+      <w:pPr/>
+      <w:r>
+        <w:t>Формула / суть: Для каждой темы события — p ~ Beta(α, β) с применённым decay, берётся max(p) по темам, умножается на score_bayes_weight.</w:t>
+      </w:r>
+    </w:p>
+    <w:p>
+      <w:pPr/>
+      <w:r>
+        <w:t>Входы: user_topic_stats, events.topics.</w:t>
+      </w:r>
+    </w:p>
+    <w:p>
+      <w:pPr/>
+      <w:r>
+        <w:t>Вес в config.py: score_bayes_weight = 5.0</w:t>
+      </w:r>
+    </w:p>
+    <w:p>
+      <w:pPr/>
+      <w:r>
+        <w:t>Что добавляет в выдачу: Долгосрочная адаптация под темы + автоматический explore/exploit.</w:t>
+      </w:r>
+    </w:p>
+    <w:p>
+      <w:pPr>
+        <w:pStyle w:val="H3"/>
+      </w:pPr>
+      <w:r>
+        <w:t>Компонент 4. quality (качество события)</w:t>
+      </w:r>
+    </w:p>
+    <w:p>
+      <w:pPr/>
+      <w:r>
+        <w:t>Формула / суть: (event.quality_score / 10.0) × score_quality_weight.</w:t>
+      </w:r>
+    </w:p>
+    <w:p>
+      <w:pPr/>
+      <w:r>
+        <w:t>Входы: events.quality_score (LLM при нормализации).</w:t>
+      </w:r>
+    </w:p>
+    <w:p>
+      <w:pPr/>
+      <w:r>
+        <w:t>Вес в config.py: score_quality_weight = 0.5</w:t>
+      </w:r>
+    </w:p>
+    <w:p>
+      <w:pPr/>
+      <w:r>
+        <w:t>Что добавляет в выдачу: Поднимает содержательное, опускает «вебинары-однодневки».</w:t>
+      </w:r>
+    </w:p>
+    <w:p>
+      <w:pPr>
+        <w:pStyle w:val="H3"/>
+      </w:pPr>
+      <w:r>
+        <w:t>Компонент 5. hype (хайп / актуальность)</w:t>
+      </w:r>
+    </w:p>
+    <w:p>
+      <w:pPr/>
+      <w:r>
+        <w:t>Формула / суть: (event.hype_score / 10.0) × score_hype_weight.</w:t>
+      </w:r>
+    </w:p>
+    <w:p>
+      <w:pPr/>
+      <w:r>
+        <w:t>Входы: events.hype_score (LLM при нормализации).</w:t>
+      </w:r>
+    </w:p>
+    <w:p>
+      <w:pPr/>
+      <w:r>
+        <w:t>Вес в config.py: score_hype_weight = 0.3</w:t>
+      </w:r>
+    </w:p>
+    <w:p>
+      <w:pPr/>
+      <w:r>
+        <w:t>Что добавляет в выдачу: Громкие конференции выигрывают у нишевых при прочих равных.</w:t>
+      </w:r>
+    </w:p>
+    <w:p>
+      <w:pPr>
+        <w:pStyle w:val="H3"/>
+      </w:pPr>
+      <w:r>
+        <w:t>Компонент 6. freshness (свежесть даты)</w:t>
+      </w:r>
+    </w:p>
+    <w:p>
+      <w:pPr/>
+      <w:r>
+        <w:t>Формула / суть: exp(−ln(2) × |days| / freshness_half_life_days) × score_freshness_weight. half_life_days = 30 по умолчанию.</w:t>
+      </w:r>
+    </w:p>
+    <w:p>
+      <w:pPr/>
+      <w:r>
+        <w:t>Входы: events.date, settings.freshness_half_life_days.</w:t>
+      </w:r>
+    </w:p>
+    <w:p>
+      <w:pPr/>
+      <w:r>
+        <w:t>Вес в config.py: score_freshness_weight = 2.0</w:t>
+      </w:r>
+    </w:p>
+    <w:p>
+      <w:pPr/>
+      <w:r>
+        <w:t>Что добавляет в выдачу: Прошедшие и далёкие-будущие события мягко уходят в хвост.</w:t>
+      </w:r>
+    </w:p>
+    <w:p>
+      <w:pPr>
+        <w:pStyle w:val="H3"/>
+      </w:pPr>
+      <w:r>
+        <w:t>Компонент 7. skill_gap (соответствие карьерным целям)</w:t>
+      </w:r>
+    </w:p>
+    <w:p>
+      <w:pPr/>
+      <w:r>
+        <w:t>Формула / суть: |target_skills ∩ event.tech_stack| / |target_skills| + бонус за seniority. × score_skill_gap_weight.</w:t>
+      </w:r>
+    </w:p>
+    <w:p>
+      <w:pPr/>
+      <w:r>
+        <w:t>Входы: user_skill_profiles, events.tech_stack, events.seniority.</w:t>
+      </w:r>
+    </w:p>
+    <w:p>
+      <w:pPr/>
+      <w:r>
+        <w:t>Вес в config.py: score_skill_gap_weight = 3.0</w:t>
+      </w:r>
+    </w:p>
+    <w:p>
+      <w:pPr/>
+      <w:r>
+        <w:t>Что добавляет в выдачу: Превращает рекомендатель из «интересного» в «приближающее к цели». Работает только после /bio cold-start.</w:t>
+      </w:r>
+    </w:p>
+    <w:p>
+      <w:pPr>
+        <w:pStyle w:val="H3"/>
+      </w:pPr>
+      <w:r>
+        <w:t>Компонент 8. bandit (LinUCB)</w:t>
+      </w:r>
+    </w:p>
+    <w:p>
+      <w:pPr/>
+      <w:r>
+        <w:t>Формула / суть: UCB: xᵀθ̂ + α·√(xᵀA⁻¹x), где θ̂ = A⁻¹·b. x — 16-мерный контекстный вектор пары (user, event). × bandit_weight.</w:t>
+      </w:r>
+    </w:p>
+    <w:p>
+      <w:pPr/>
+      <w:r>
+        <w:t>Входы: user_bandit_states (A, b).</w:t>
+      </w:r>
+    </w:p>
+    <w:p>
+      <w:pPr/>
+      <w:r>
+        <w:t>Вес в config.py: bandit_weight = 2.0</w:t>
+      </w:r>
+    </w:p>
+    <w:p>
+      <w:pPr/>
+      <w:r>
+        <w:t>Что добавляет в выдачу: Контекстная online-персонализация + exploration-бонус событиям с непривычным контекстом.</w:t>
+      </w:r>
+    </w:p>
+    <w:p>
+      <w:pPr>
+        <w:pStyle w:val="H3"/>
+      </w:pPr>
+      <w:r>
+        <w:t>Компонент 9. gnn (LightGCN коллаборативный)</w:t>
+      </w:r>
+    </w:p>
+    <w:p>
+      <w:pPr/>
+      <w:r>
+        <w:t>Формула / суть: user_emb · event_emb из натренированной LightGCN-модели. × gnn_weight.</w:t>
+      </w:r>
+    </w:p>
+    <w:p>
+      <w:pPr/>
+      <w:r>
+        <w:t>Входы: data/gnn_embeddings.npz (от scripts/train_gnn.py).</w:t>
+      </w:r>
+    </w:p>
+    <w:p>
+      <w:pPr/>
+      <w:r>
+        <w:t>Вес в config.py: gnn_weight = 3.0; GNN_ENABLED=false по умолчанию</w:t>
+      </w:r>
+    </w:p>
+    <w:p>
+      <w:pPr/>
+      <w:r>
+        <w:t>Что добавляет в выдачу: «Похожие на тебя лайкали вот это». На малом датасете выключен; включается явно после тренировки.</w:t>
+      </w:r>
+    </w:p>
+    <w:p>
+      <w:pPr>
+        <w:pStyle w:val="H2"/>
+      </w:pPr>
+      <w:r>
+        <w:t>7.4. Как 9 компонент работают вместе</w:t>
+      </w:r>
+    </w:p>
+    <w:p>
+      <w:pPr>
+        <w:pStyle w:val="H3"/>
+      </w:pPr>
+      <w:r>
+        <w:t>Шаг 1. Подсчёт hybrid_score</w:t>
+      </w:r>
+    </w:p>
+    <w:p>
+      <w:pPr/>
+      <w:r>
+        <w:t>На /recommend бэкенд достаёт все события и для каждого вызывает compute_score_breakdown(user, event, db). Внутри последовательно считаются 9 компонент, каждая в try/except. Сбой → 0.0 в breakdown + WARNING в логи. Итоговый score = сумма breakdown.</w:t>
+      </w:r>
+    </w:p>
+    <w:p>
+      <w:pPr>
+        <w:pStyle w:val="H3"/>
+      </w:pPr>
+      <w:r>
+        <w:t>Шаг 2. Сортировка и MMR</w:t>
+      </w:r>
+    </w:p>
+    <w:p>
+      <w:pPr/>
+      <w:r>
+        <w:t>Сортировка по score убыванию. Поверх — MMR (λ=0.7): каждое следующее событие должно быть и релевантным, и не слишком похожим на уже выбранные. Без MMR в топ-5 иногда попадали 5 митапов про Kubernetes.</w:t>
+      </w:r>
+    </w:p>
+    <w:p>
+      <w:pPr>
+        <w:pStyle w:val="H3"/>
+      </w:pPr>
+      <w:r>
+        <w:t>Шаг 3. Передача в бот</w:t>
+      </w:r>
+    </w:p>
+    <w:p>
+      <w:pPr/>
+      <w:r>
+        <w:t>API возвращает JSON: title, description, score, score_breakdown, explanation. Бот рендерит первую карточку и кнопки ❓ Почему / 📖 Подробнее / 👍 / 👎 / ⭐ / Похожие / Следующее. Полный explanation — по кнопке, а не в самой карточке.</w:t>
+      </w:r>
+    </w:p>
+    <w:p>
+      <w:pPr>
+        <w:pStyle w:val="H3"/>
+      </w:pPr>
+      <w:r>
+        <w:t>Шаг 4. Обратная связь</w:t>
+      </w:r>
+    </w:p>
+    <w:p>
+      <w:pPr/>
+      <w:r>
+        <w:t>Каждый лайк/дизлайк/save обновляет четыре подсистемы в одной транзакции:</w:t>
+      </w:r>
+    </w:p>
+    <w:p>
+      <w:pPr>
+        <w:pStyle w:val="ListBullet"/>
+      </w:pPr>
+      <w:r>
+        <w:t>topic_weights в users (+3 / −2 / +1 по темам события)</w:t>
+      </w:r>
+    </w:p>
+    <w:p>
+      <w:pPr>
+        <w:pStyle w:val="ListBullet"/>
+      </w:pPr>
+      <w:r>
+        <w:t>alpha/beta в user_topic_stats (соответственно)</w:t>
+      </w:r>
+    </w:p>
+    <w:p>
+      <w:pPr>
+        <w:pStyle w:val="ListBullet"/>
+      </w:pPr>
+      <w:r>
+        <w:t>Матрица A и вектор b в user_bandit_states (LinUCB)</w:t>
+      </w:r>
+    </w:p>
+    <w:p>
+      <w:pPr>
+        <w:pStyle w:val="ListBullet"/>
+      </w:pPr>
+      <w:r>
+        <w:t>Long-term memory — best-effort: LLM пишет заметку, если фидбэк значимый. Изолировано в SAVEPOINT.</w:t>
+      </w:r>
+    </w:p>
+    <w:p>
+      <w:pPr/>
+      <w:r>
+        <w:t>Команда /undo делает rollback во ВСЕХ четырёх подсистемах с direction=-1 — в большинстве рекомендательных систем бандит «не умеет забывать», у нас умеет.</w:t>
+      </w:r>
+    </w:p>
+    <w:p>
+      <w:pPr>
+        <w:pStyle w:val="H3"/>
+      </w:pPr>
+      <w:r>
+        <w:t>Шаг 5. Объяснимость</w:t>
+      </w:r>
+    </w:p>
+    <w:p>
+      <w:pPr/>
+      <w:r>
+        <w:t>Поскольку каждый компонент возвращает свой вклад, мы знаем «кто сколько весит». Из этого две вещи:</w:t>
+      </w:r>
+    </w:p>
+    <w:p>
+      <w:pPr>
+        <w:pStyle w:val="ListBullet"/>
+      </w:pPr>
+      <w:r>
+        <w:t>❓ Почему — короткий ответ LLM в поп-апе (1–2 предложения, без цифр, с привязкой к одному конкретному факту: тема, target_skill, лайкнутое событие).</w:t>
+      </w:r>
+    </w:p>
+    <w:p>
+      <w:pPr>
+        <w:pStyle w:val="ListBullet"/>
+      </w:pPr>
+      <w:r>
+        <w:t>📖 Подробнее — отдельное сообщение: LLM-нарратив + 1–2 совета + rule-based разбивка по компонентам с числами + counterfactual («без skill_gap-сигнала событие потеряло бы ~45 % веса»).</w:t>
+      </w:r>
+    </w:p>
+    <w:p>
+      <w:pPr>
+        <w:pStyle w:val="H3"/>
+      </w:pPr>
+      <w:r>
+        <w:t>Шаг 6. Контекстная и коллаборативная парадигмы — в одной системе</w:t>
+      </w:r>
+    </w:p>
+    <w:p>
+      <w:pPr>
+        <w:pStyle w:val="ListBullet"/>
+      </w:pPr>
+      <w:r>
+        <w:t>КОНТЕКСТНАЯ — компонент bandit (LinUCB) считает рекомендации с учётом 16-мерного контекстного вектора пары. Per-user A и b обновляются онлайн на каждый фидбэк. Classic contextual bandit.</w:t>
+      </w:r>
+    </w:p>
+    <w:p>
+      <w:pPr>
+        <w:pStyle w:val="ListBullet"/>
+      </w:pPr>
+      <w:r>
+        <w:t>КОЛЛАБОРАТИВНАЯ — компонент gnn (LightGCN) строит двудольный граф user↔event по лайкам/saves и через пропагацию по графу получает эмбеддинги, где похожие пользователи и события рядом. Чистый numpy, без torch-geometric. По умолчанию выключен — мал датасет.</w:t>
+      </w:r>
+    </w:p>
+    <w:p>
+      <w:pPr/>
+      <w:r>
+        <w:t>Помимо этих двух, в hybrid есть content-based (cosine), rule-based (rule), Bayesian preference (bayesian) и эвристики (quality, hype, freshness, skill_gap). Hybrid = композиция четырёх парадигм + три эвристики.</w:t>
+      </w:r>
+    </w:p>
+    <w:p>
+      <w:pPr>
+        <w:pStyle w:val="H3"/>
+      </w:pPr>
+      <w:r>
+        <w:t>Сводка: 9 компонент в одной таблице</w:t>
+      </w:r>
+    </w:p>
+    <w:tbl>
+      <w:tblPr>
+        <w:tblStyle w:val="LightGrid-Accent1"/>
+        <w:tblW w:type="auto" w:w="0"/>
+        <w:tblLook w:firstColumn="1" w:firstRow="1" w:lastColumn="0" w:lastRow="0" w:noHBand="0" w:noVBand="1" w:val="04A0"/>
+      </w:tblPr>
+      <w:tblGrid>
+        <w:gridCol w:w="2160"/>
+        <w:gridCol w:w="2160"/>
+        <w:gridCol w:w="2160"/>
+        <w:gridCol w:w="2160"/>
+      </w:tblGrid>
+      <w:tr>
+        <w:tc>
+          <w:tcPr>
+            <w:tcW w:type="dxa" w:w="2160"/>
+          </w:tcPr>
+          <w:p>
+            <w:r>
+              <w:t>Компонент</w:t>
+            </w:r>
+          </w:p>
+        </w:tc>
+        <w:tc>
+          <w:tcPr>
+            <w:tcW w:type="dxa" w:w="2160"/>
+          </w:tcPr>
+          <w:p>
+            <w:r>
+              <w:t>Парадигма</w:t>
+            </w:r>
+          </w:p>
+        </w:tc>
+        <w:tc>
+          <w:tcPr>
+            <w:tcW w:type="dxa" w:w="2160"/>
+          </w:tcPr>
+          <w:p>
+            <w:r>
+              <w:t>Источник данных</w:t>
+            </w:r>
+          </w:p>
+        </w:tc>
+        <w:tc>
+          <w:tcPr>
+            <w:tcW w:type="dxa" w:w="2160"/>
+          </w:tcPr>
+          <w:p>
+            <w:r>
+              <w:t>Что добавляет</w:t>
+            </w:r>
+          </w:p>
+        </w:tc>
+      </w:tr>
+      <w:tr>
+        <w:tc>
+          <w:tcPr>
+            <w:tcW w:type="dxa" w:w="2160"/>
+          </w:tcPr>
+          <w:p>
+            <w:r>
+              <w:t>rule</w:t>
+            </w:r>
+          </w:p>
+        </w:tc>
+        <w:tc>
+          <w:tcPr>
+            <w:tcW w:type="dxa" w:w="2160"/>
+          </w:tcPr>
+          <w:p>
+            <w:r>
+              <w:t>Rule-based</w:t>
+            </w:r>
+          </w:p>
+        </w:tc>
+        <w:tc>
+          <w:tcPr>
+            <w:tcW w:type="dxa" w:w="2160"/>
+          </w:tcPr>
+          <w:p>
+            <w:r>
+              <w:t>Профиль и темы события</w:t>
+            </w:r>
+          </w:p>
+        </w:tc>
+        <w:tc>
+          <w:tcPr>
+            <w:tcW w:type="dxa" w:w="2160"/>
+          </w:tcPr>
+          <w:p>
+            <w:r>
+              <w:t>Фолбэк без AI</w:t>
+            </w:r>
+          </w:p>
+        </w:tc>
+      </w:tr>
+      <w:tr>
+        <w:tc>
+          <w:tcPr>
+            <w:tcW w:type="dxa" w:w="2160"/>
+          </w:tcPr>
+          <w:p>
+            <w:r>
+              <w:t>cosine</w:t>
+            </w:r>
+          </w:p>
+        </w:tc>
+        <w:tc>
+          <w:tcPr>
+            <w:tcW w:type="dxa" w:w="2160"/>
+          </w:tcPr>
+          <w:p>
+            <w:r>
+              <w:t>Content-based</w:t>
+            </w:r>
+          </w:p>
+        </w:tc>
+        <w:tc>
+          <w:tcPr>
+            <w:tcW w:type="dxa" w:w="2160"/>
+          </w:tcPr>
+          <w:p>
+            <w:r>
+              <w:t>Embeddings</w:t>
+            </w:r>
+          </w:p>
+        </w:tc>
+        <w:tc>
+          <w:tcPr>
+            <w:tcW w:type="dxa" w:w="2160"/>
+          </w:tcPr>
+          <w:p>
+            <w:r>
+              <w:t>Близость по смыслу</w:t>
+            </w:r>
+          </w:p>
+        </w:tc>
+      </w:tr>
+      <w:tr>
+        <w:tc>
+          <w:tcPr>
+            <w:tcW w:type="dxa" w:w="2160"/>
+          </w:tcPr>
+          <w:p>
+            <w:r>
+              <w:t>bayesian</w:t>
+            </w:r>
+          </w:p>
+        </w:tc>
+        <w:tc>
+          <w:tcPr>
+            <w:tcW w:type="dxa" w:w="2160"/>
+          </w:tcPr>
+          <w:p>
+            <w:r>
+              <w:t>Bayesian preference</w:t>
+            </w:r>
+          </w:p>
+        </w:tc>
+        <w:tc>
+          <w:tcPr>
+            <w:tcW w:type="dxa" w:w="2160"/>
+          </w:tcPr>
+          <w:p>
+            <w:r>
+              <w:t>α/β по темам</w:t>
+            </w:r>
+          </w:p>
+        </w:tc>
+        <w:tc>
+          <w:tcPr>
+            <w:tcW w:type="dxa" w:w="2160"/>
+          </w:tcPr>
+          <w:p>
+            <w:r>
+              <w:t>Адаптация + explore/exploit</w:t>
+            </w:r>
+          </w:p>
+        </w:tc>
+      </w:tr>
+      <w:tr>
+        <w:tc>
+          <w:tcPr>
+            <w:tcW w:type="dxa" w:w="2160"/>
+          </w:tcPr>
+          <w:p>
+            <w:r>
+              <w:t>quality</w:t>
+            </w:r>
+          </w:p>
+        </w:tc>
+        <w:tc>
+          <w:tcPr>
+            <w:tcW w:type="dxa" w:w="2160"/>
+          </w:tcPr>
+          <w:p>
+            <w:r>
+              <w:t>Эвристика качества</w:t>
+            </w:r>
+          </w:p>
+        </w:tc>
+        <w:tc>
+          <w:tcPr>
+            <w:tcW w:type="dxa" w:w="2160"/>
+          </w:tcPr>
+          <w:p>
+            <w:r>
+              <w:t>LLM-оценка</w:t>
+            </w:r>
+          </w:p>
+        </w:tc>
+        <w:tc>
+          <w:tcPr>
+            <w:tcW w:type="dxa" w:w="2160"/>
+          </w:tcPr>
+          <w:p>
+            <w:r>
+              <w:t>Содержательные в топ</w:t>
+            </w:r>
+          </w:p>
+        </w:tc>
+      </w:tr>
+      <w:tr>
+        <w:tc>
+          <w:tcPr>
+            <w:tcW w:type="dxa" w:w="2160"/>
+          </w:tcPr>
+          <w:p>
+            <w:r>
+              <w:t>hype</w:t>
+            </w:r>
+          </w:p>
+        </w:tc>
+        <w:tc>
+          <w:tcPr>
+            <w:tcW w:type="dxa" w:w="2160"/>
+          </w:tcPr>
+          <w:p>
+            <w:r>
+              <w:t>Эвристика хайпа</w:t>
+            </w:r>
+          </w:p>
+        </w:tc>
+        <w:tc>
+          <w:tcPr>
+            <w:tcW w:type="dxa" w:w="2160"/>
+          </w:tcPr>
+          <w:p>
+            <w:r>
+              <w:t>LLM-оценка</w:t>
+            </w:r>
+          </w:p>
+        </w:tc>
+        <w:tc>
+          <w:tcPr>
+            <w:tcW w:type="dxa" w:w="2160"/>
+          </w:tcPr>
+          <w:p>
+            <w:r>
+              <w:t>Громкие события в топ</w:t>
+            </w:r>
+          </w:p>
+        </w:tc>
+      </w:tr>
+      <w:tr>
+        <w:tc>
+          <w:tcPr>
+            <w:tcW w:type="dxa" w:w="2160"/>
+          </w:tcPr>
+          <w:p>
+            <w:r>
+              <w:t>freshness</w:t>
+            </w:r>
+          </w:p>
+        </w:tc>
+        <w:tc>
+          <w:tcPr>
+            <w:tcW w:type="dxa" w:w="2160"/>
+          </w:tcPr>
+          <w:p>
+            <w:r>
+              <w:t>Эвристика времени</w:t>
+            </w:r>
+          </w:p>
+        </w:tc>
+        <w:tc>
+          <w:tcPr>
+            <w:tcW w:type="dxa" w:w="2160"/>
+          </w:tcPr>
+          <w:p>
+            <w:r>
+              <w:t>Дата события</w:t>
+            </w:r>
+          </w:p>
+        </w:tc>
+        <w:tc>
+          <w:tcPr>
+            <w:tcW w:type="dxa" w:w="2160"/>
+          </w:tcPr>
+          <w:p>
+            <w:r>
+              <w:t>Прошедшие/далёкие вниз</w:t>
+            </w:r>
+          </w:p>
+        </w:tc>
+      </w:tr>
+      <w:tr>
+        <w:tc>
+          <w:tcPr>
+            <w:tcW w:type="dxa" w:w="2160"/>
+          </w:tcPr>
+          <w:p>
+            <w:r>
+              <w:t>skill_gap</w:t>
+            </w:r>
+          </w:p>
+        </w:tc>
+        <w:tc>
+          <w:tcPr>
+            <w:tcW w:type="dxa" w:w="2160"/>
+          </w:tcPr>
+          <w:p>
+            <w:r>
+              <w:t>Goal-aware</w:t>
+            </w:r>
+          </w:p>
+        </w:tc>
+        <w:tc>
+          <w:tcPr>
+            <w:tcW w:type="dxa" w:w="2160"/>
+          </w:tcPr>
+          <w:p>
+            <w:r>
+              <w:t>Skill-профиль + tech_stack</w:t>
+            </w:r>
+          </w:p>
+        </w:tc>
+        <w:tc>
+          <w:tcPr>
+            <w:tcW w:type="dxa" w:w="2160"/>
+          </w:tcPr>
+          <w:p>
+            <w:r>
+              <w:t>Под карьерные цели</w:t>
+            </w:r>
+          </w:p>
+        </w:tc>
+      </w:tr>
+      <w:tr>
+        <w:tc>
+          <w:tcPr>
+            <w:tcW w:type="dxa" w:w="2160"/>
+          </w:tcPr>
+          <w:p>
+            <w:r>
+              <w:t>bandit</w:t>
+            </w:r>
+          </w:p>
+        </w:tc>
+        <w:tc>
+          <w:tcPr>
+            <w:tcW w:type="dxa" w:w="2160"/>
+          </w:tcPr>
+          <w:p>
+            <w:r>
+              <w:t>Contextual bandit</w:t>
+            </w:r>
+          </w:p>
+        </w:tc>
+        <w:tc>
+          <w:tcPr>
+            <w:tcW w:type="dxa" w:w="2160"/>
+          </w:tcPr>
+          <w:p>
+            <w:r>
+              <w:t>Матрица A, вектор b</w:t>
+            </w:r>
+          </w:p>
+        </w:tc>
+        <w:tc>
+          <w:tcPr>
+            <w:tcW w:type="dxa" w:w="2160"/>
+          </w:tcPr>
+          <w:p>
+            <w:r>
+              <w:t>Контекстная персонализация</w:t>
+            </w:r>
+          </w:p>
+        </w:tc>
+      </w:tr>
+      <w:tr>
+        <w:tc>
+          <w:tcPr>
+            <w:tcW w:type="dxa" w:w="2160"/>
+          </w:tcPr>
+          <w:p>
+            <w:r>
+              <w:t>gnn</w:t>
+            </w:r>
+          </w:p>
+        </w:tc>
+        <w:tc>
+          <w:tcPr>
+            <w:tcW w:type="dxa" w:w="2160"/>
+          </w:tcPr>
+          <w:p>
+            <w:r>
+              <w:t>Collaborative</w:t>
+            </w:r>
+          </w:p>
+        </w:tc>
+        <w:tc>
+          <w:tcPr>
+            <w:tcW w:type="dxa" w:w="2160"/>
+          </w:tcPr>
+          <w:p>
+            <w:r>
+              <w:t>Граф user↔event</w:t>
+            </w:r>
+          </w:p>
+        </w:tc>
+        <w:tc>
+          <w:tcPr>
+            <w:tcW w:type="dxa" w:w="2160"/>
+          </w:tcPr>
+          <w:p>
+            <w:r>
+              <w:t>Похожие на тебя лайкали</w:t>
+            </w:r>
+          </w:p>
+        </w:tc>
+      </w:tr>
+    </w:tbl>
     <w:sectPr>
       <w:pgSz w:w="12240" w:h="15840"/>
       <w:pgMar w:top="1440" w:right="1800" w:bottom="1440" w:left="1800" w:header="720" w:footer="720" w:gutter="0"/>

</xml_diff>

<commit_message>
test(pg): pgvector-path tests; docs: sync facts + expand backlog
- tests/test_pgvector.py: бэкенд-детекция + SQLite-fallback (детерминированно,
  гоняется в CI) + gated интеграционный <=>-смоук на реальном PG (скип на SQLite)
- docs: в regenerate_docs.py исправлены имена copilot-tools (6 верных вместо
  устаревших get_recent_interactions/get_event_details), счётчики тестов
  (180/25), добавлен раздел 3.0 про Postgres/масштабирование/ops; все три .docx
  перегенерированы (0 устаревших ссылок). README — те же правки фактов.
- IMPROVEMENTS.md: отмечены сделанные (Postgres-тесты, синк фактов docs),
  добавлены новые фиксы (валидация ISO-даты, side-effect на чтении, кэш, дедуп
  через pgvector, наблюдаемость, валидация конфига) + раздел 🚀 крупных
  функциональных улучшений (learning-to-rank, cross-encoder reranker, гео,
  календарь, соц-слой, активное обучение, мультимодальность, дашборд, A/B).

tests: 177 passed, 3 skipped; ruff = 0.

Co-Authored-By: Claude Opus 4.8 <noreply@anthropic.com>
</commit_message>
<xml_diff>
--- a/docs/Обзор_проекта_EventMind.docx
+++ b/docs/Обзор_проекта_EventMind.docx
@@ -115,7 +115,7 @@
         <w:pStyle w:val="ListBullet"/>
       </w:pPr>
       <w:r>
-        <w:t>pytest 8.2 — 170 тестов проходят, ruff — без ошибок</w:t>
+        <w:t>pytest 8.2 — 180 тестов проходят, ruff — без ошибок</w:t>
       </w:r>
     </w:p>
     <w:p>
@@ -211,7 +211,7 @@
         <w:pStyle w:val="ListBullet"/>
       </w:pPr>
       <w:r>
-        <w:t>tests — 26 файлов, 170 кейсов: scoring, hybrid, bayesian, bandit, gnn, memory, dedup, ingestion, supervisor, copilot tools, cold-start, scheduler</w:t>
+        <w:t>tests — 25 файлов, 180 кейсов: scoring, hybrid, bayesian, bandit, gnn, memory, dedup, ingestion, supervisor, copilot tools, cold-start, scheduler</w:t>
       </w:r>
     </w:p>
     <w:p>
@@ -275,7 +275,7 @@
         <w:pStyle w:val="ListBullet"/>
       </w:pPr>
       <w:r>
-        <w:t>AI Copilot: Supervisor-Worker граф LangGraph с пятью специалистами (recommendation, career_coach, roadmap, explainer, summary); пять function-calling tools (search_events, get_user_profile, get_recent_interactions, recall_about_user, get_event_details); история диалога — в copilot_sessions, multi-turn память; long-term memory подмешивается в recall.</w:t>
+        <w:t>AI Copilot: Supervisor-Worker граф LangGraph с пятью специалистами (recommendation, career_coach, roadmap, explainer, summary); шесть function-calling tools (search_events, get_user_profile, get_interactions_summary, explain_event, recall_about_user, mark_saved); история диалога — в copilot_sessions, multi-turn память; long-term memory подмешивается в recall.</w:t>
       </w:r>
     </w:p>
     <w:p>
@@ -324,6 +324,54 @@
       </w:pPr>
       <w:r>
         <w:t>3. Доработки мая 2026</w:t>
+      </w:r>
+    </w:p>
+    <w:p>
+      <w:pPr>
+        <w:pStyle w:val="H3"/>
+      </w:pPr>
+      <w:r>
+        <w:t>3.0. Новейшее: Postgres/Supabase, масштабирование, ops</w:t>
+      </w:r>
+    </w:p>
+    <w:p>
+      <w:pPr>
+        <w:pStyle w:val="ListBullet"/>
+      </w:pPr>
+      <w:r>
+        <w:t>Dev-БД переведена на управляемый PostgreSQL (Supabase, session pooler): pgvector активен, retrieval и кандидатный отбор идут через индекс &lt;=&gt;; engine с pool_pre_ping для устойчивости к простаивающим соединениям.</w:t>
+      </w:r>
+    </w:p>
+    <w:p>
+      <w:pPr>
+        <w:pStyle w:val="ListBullet"/>
+      </w:pPr>
+      <w:r>
+        <w:t>Масштабирование /recommendations: кандидатный отбор top-N через pgvector (вместо скоринга всего каталога) + joinedload против N+1 на темах; тяжёлые объяснения строятся только для возвращаемого top-N.</w:t>
+      </w:r>
+    </w:p>
+    <w:p>
+      <w:pPr>
+        <w:pStyle w:val="ListBullet"/>
+      </w:pPr>
+      <w:r>
+        <w:t>Ingestion: единый POST /ingestion/load-all (все источники по очереди), POST /ingestion/retry-failed, батчевая LLM-нормализация (несколько событий на один вызов — экономия токенов) с early-stop на rate-limit (429/TPD); embedding_vec пишется сразу при нормализации.</w:t>
+      </w:r>
+    </w:p>
+    <w:p>
+      <w:pPr>
+        <w:pStyle w:val="ListBullet"/>
+      </w:pPr>
+      <w:r>
+        <w:t>Данные: events.start_at (DateTime) для freshness/сортировки + raw_events.retry_count (retry-failed пропускает безнадёжные после N попыток).</w:t>
+      </w:r>
+    </w:p>
+    <w:p>
+      <w:pPr>
+        <w:pStyle w:val="ListBullet"/>
+      </w:pPr>
+      <w:r>
+        <w:t>Ops/качество: scheduler на logging; ruff = 0 ошибок по репо; CI на GitHub Actions (ruff + pytest); LLM-обёртка строится лениво (импорт не требует ключа).</w:t>
       </w:r>
     </w:p>
     <w:p>
@@ -449,7 +497,7 @@
     <w:p>
       <w:pPr/>
       <w:r>
-        <w:t>ruff на app/ — без ошибок. Тестовый набор — 170 кейсов в 26 файлах, покрывает scoring, bayesian, bandit, gnn, memory, dedup, ingestion, supervisor, copilot tools, cold-start, scheduler. Pytest-фикстуры используют отдельный SQLite-файл с in-memory mode, чтобы тесты не конфликтовали с dev-БД.</w:t>
+        <w:t>ruff на app/ — без ошибок. Тестовый набор — 180 кейсов в 25 файлах, покрывает scoring, bayesian, bandit, gnn, memory, dedup, ingestion, supervisor, copilot tools, cold-start, scheduler. Pytest-фикстуры используют отдельный SQLite-файл с in-memory mode, чтобы тесты не конфликтовали с dev-БД.</w:t>
       </w:r>
     </w:p>
     <w:p>

</xml_diff>